<commit_message>
Added Java practice programs
</commit_message>
<xml_diff>
--- a/Java_Practice_Programs/30Days Practice.docx
+++ b/Java_Practice_Programs/30Days Practice.docx
@@ -324,15 +324,7 @@
           <w:bCs/>
           <w:highlight w:val="green"/>
         </w:rPr>
-        <w:t xml:space="preserve"> </w:t>
-      </w:r>
-      <w:r>
-        <w:rPr>
-          <w:b/>
-          <w:bCs/>
-          <w:highlight w:val="green"/>
-        </w:rPr>
-        <w:t>if(</w:t>
+        <w:t xml:space="preserve"> if(</w:t>
       </w:r>
       <w:proofErr w:type="spellStart"/>
       <w:proofErr w:type="gramStart"/>
@@ -370,15 +362,184 @@
           <w:bCs/>
           <w:highlight w:val="green"/>
         </w:rPr>
-        <w:t>))</w:t>
-      </w:r>
-      <w:r>
+        <w:t>))]</w:t>
+      </w:r>
+    </w:p>
+    <w:p>
+      <w:r>
+        <w:rPr>
+          <w:rFonts w:ascii="Segoe UI Emoji" w:hAnsi="Segoe UI Emoji" w:cs="Segoe UI Emoji"/>
+        </w:rPr>
+        <w:t>👉</w:t>
+      </w:r>
+      <w:r>
+        <w:t xml:space="preserve"> Interview focus:</w:t>
+      </w:r>
+    </w:p>
+    <w:p>
+      <w:pPr>
+        <w:numPr>
+          <w:ilvl w:val="0"/>
+          <w:numId w:val="2"/>
+        </w:numPr>
         <w:rPr>
           <w:b/>
           <w:bCs/>
           <w:highlight w:val="green"/>
         </w:rPr>
-        <w:t>]</w:t>
+      </w:pPr>
+      <w:r>
+        <w:t xml:space="preserve">Difference between == </w:t>
+      </w:r>
+      <w:proofErr w:type="gramStart"/>
+      <w:r>
+        <w:t xml:space="preserve">and .equals() </w:t>
+      </w:r>
+      <w:r>
+        <w:t xml:space="preserve">  </w:t>
+      </w:r>
+      <w:proofErr w:type="gramEnd"/>
+      <w:r>
+        <w:rPr>
+          <w:b/>
+          <w:bCs/>
+          <w:highlight w:val="green"/>
+        </w:rPr>
+        <w:t xml:space="preserve">[== compare the value at the specific mem location, </w:t>
+      </w:r>
+      <w:proofErr w:type="gramStart"/>
+      <w:r>
+        <w:rPr>
+          <w:b/>
+          <w:bCs/>
+          <w:highlight w:val="green"/>
+        </w:rPr>
+        <w:t>where .equals</w:t>
+      </w:r>
+      <w:proofErr w:type="gramEnd"/>
+      <w:r>
+        <w:rPr>
+          <w:b/>
+          <w:bCs/>
+          <w:highlight w:val="green"/>
+        </w:rPr>
+        <w:t xml:space="preserve"> to compare the values of variable] [== compare </w:t>
+      </w:r>
+      <w:proofErr w:type="gramStart"/>
+      <w:r>
+        <w:rPr>
+          <w:b/>
+          <w:bCs/>
+          <w:highlight w:val="green"/>
+        </w:rPr>
+        <w:t>Reference ,</w:t>
+      </w:r>
+      <w:proofErr w:type="gramEnd"/>
+      <w:r>
+        <w:rPr>
+          <w:b/>
+          <w:bCs/>
+          <w:highlight w:val="green"/>
+        </w:rPr>
+        <w:t xml:space="preserve"> .equals compare Content]</w:t>
+      </w:r>
+    </w:p>
+    <w:p>
+      <w:pPr>
+        <w:numPr>
+          <w:ilvl w:val="0"/>
+          <w:numId w:val="2"/>
+        </w:numPr>
+      </w:pPr>
+      <w:r>
+        <w:t xml:space="preserve">Why String is immutable? </w:t>
+      </w:r>
+      <w:r>
+        <w:t xml:space="preserve"> </w:t>
+      </w:r>
+    </w:p>
+    <w:p>
+      <w:r>
+        <w:pict w14:anchorId="7A2C8088">
+          <v:rect id="_x0000_i1025" style="width:0;height:1.5pt" o:hralign="center" o:hrstd="t" o:hr="t" fillcolor="#a0a0a0" stroked="f"/>
+        </w:pict>
+      </w:r>
+    </w:p>
+    <w:p>
+      <w:pPr>
+        <w:rPr>
+          <w:b/>
+          <w:bCs/>
+        </w:rPr>
+      </w:pPr>
+      <w:r>
+        <w:rPr>
+          <w:b/>
+          <w:bCs/>
+        </w:rPr>
+        <w:t>Day 3–4: Numbers &amp; Patterns</w:t>
+      </w:r>
+    </w:p>
+    <w:p>
+      <w:pPr>
+        <w:numPr>
+          <w:ilvl w:val="0"/>
+          <w:numId w:val="3"/>
+        </w:numPr>
+        <w:rPr>
+          <w:highlight w:val="green"/>
+        </w:rPr>
+      </w:pPr>
+      <w:r>
+        <w:rPr>
+          <w:highlight w:val="green"/>
+        </w:rPr>
+        <w:t xml:space="preserve">Fibonacci (loop + recursion) </w:t>
+      </w:r>
+    </w:p>
+    <w:p>
+      <w:pPr>
+        <w:numPr>
+          <w:ilvl w:val="0"/>
+          <w:numId w:val="3"/>
+        </w:numPr>
+        <w:rPr>
+          <w:highlight w:val="green"/>
+        </w:rPr>
+      </w:pPr>
+      <w:r>
+        <w:rPr>
+          <w:highlight w:val="green"/>
+        </w:rPr>
+        <w:t xml:space="preserve">Factorial </w:t>
+      </w:r>
+    </w:p>
+    <w:p>
+      <w:pPr>
+        <w:numPr>
+          <w:ilvl w:val="0"/>
+          <w:numId w:val="3"/>
+        </w:numPr>
+        <w:rPr>
+          <w:highlight w:val="green"/>
+        </w:rPr>
+      </w:pPr>
+      <w:r>
+        <w:rPr>
+          <w:highlight w:val="green"/>
+        </w:rPr>
+        <w:t xml:space="preserve">Armstrong number </w:t>
+      </w:r>
+    </w:p>
+    <w:p>
+      <w:pPr>
+        <w:numPr>
+          <w:ilvl w:val="0"/>
+          <w:numId w:val="3"/>
+        </w:numPr>
+      </w:pPr>
+      <w:r>
+        <w:t xml:space="preserve">Number patterns (pyramid, reverse) </w:t>
       </w:r>
     </w:p>
     <w:p>
@@ -389,210 +550,102 @@
         <w:t>👉</w:t>
       </w:r>
       <w:r>
-        <w:t xml:space="preserve"> Interview focus:</w:t>
-      </w:r>
-    </w:p>
-    <w:p>
-      <w:pPr>
-        <w:numPr>
-          <w:ilvl w:val="0"/>
-          <w:numId w:val="2"/>
-        </w:numPr>
-        <w:rPr>
-          <w:b/>
-          <w:bCs/>
+        <w:t xml:space="preserve"> Interview Q:</w:t>
+      </w:r>
+    </w:p>
+    <w:p>
+      <w:pPr>
+        <w:numPr>
+          <w:ilvl w:val="0"/>
+          <w:numId w:val="4"/>
+        </w:numPr>
+      </w:pPr>
+      <w:r>
+        <w:t xml:space="preserve">Recursion vs iteration? </w:t>
+      </w:r>
+    </w:p>
+    <w:p>
+      <w:pPr>
+        <w:numPr>
+          <w:ilvl w:val="0"/>
+          <w:numId w:val="4"/>
+        </w:numPr>
+      </w:pPr>
+      <w:r>
+        <w:t xml:space="preserve">Stack overflow in recursion? </w:t>
+      </w:r>
+    </w:p>
+    <w:p>
+      <w:r>
+        <w:pict w14:anchorId="184BD27A">
+          <v:rect id="_x0000_i1026" style="width:0;height:1.5pt" o:hralign="center" o:hrstd="t" o:hr="t" fillcolor="#a0a0a0" stroked="f"/>
+        </w:pict>
+      </w:r>
+    </w:p>
+    <w:p>
+      <w:pPr>
+        <w:rPr>
+          <w:b/>
+          <w:bCs/>
+        </w:rPr>
+      </w:pPr>
+      <w:r>
+        <w:rPr>
+          <w:b/>
+          <w:bCs/>
+        </w:rPr>
+        <w:t>Day 5–7: Strings (Very Important)</w:t>
+      </w:r>
+    </w:p>
+    <w:p>
+      <w:pPr>
+        <w:numPr>
+          <w:ilvl w:val="0"/>
+          <w:numId w:val="5"/>
+        </w:numPr>
+        <w:rPr>
           <w:highlight w:val="green"/>
         </w:rPr>
       </w:pPr>
       <w:r>
-        <w:t xml:space="preserve">Difference between == </w:t>
-      </w:r>
-      <w:proofErr w:type="gramStart"/>
-      <w:r>
-        <w:t xml:space="preserve">and .equals() </w:t>
-      </w:r>
-      <w:r>
-        <w:t xml:space="preserve">  </w:t>
-      </w:r>
-      <w:proofErr w:type="gramEnd"/>
-      <w:r>
-        <w:rPr>
-          <w:b/>
-          <w:bCs/>
+        <w:rPr>
           <w:highlight w:val="green"/>
         </w:rPr>
-        <w:t xml:space="preserve">[== compare the value at the specific mem location, </w:t>
-      </w:r>
-      <w:proofErr w:type="gramStart"/>
-      <w:r>
-        <w:rPr>
-          <w:b/>
-          <w:bCs/>
+        <w:t xml:space="preserve">Reverse string (3 ways) </w:t>
+      </w:r>
+    </w:p>
+    <w:p>
+      <w:pPr>
+        <w:numPr>
+          <w:ilvl w:val="0"/>
+          <w:numId w:val="5"/>
+        </w:numPr>
+        <w:rPr>
           <w:highlight w:val="green"/>
         </w:rPr>
-        <w:t>where .equals</w:t>
-      </w:r>
-      <w:proofErr w:type="gramEnd"/>
-      <w:r>
-        <w:rPr>
-          <w:b/>
-          <w:bCs/>
+      </w:pPr>
+      <w:r>
+        <w:rPr>
           <w:highlight w:val="green"/>
         </w:rPr>
-        <w:t xml:space="preserve"> to compare the values of variable] [== compare </w:t>
-      </w:r>
-      <w:proofErr w:type="gramStart"/>
-      <w:r>
-        <w:rPr>
-          <w:b/>
-          <w:bCs/>
+        <w:t xml:space="preserve">Anagram check </w:t>
+      </w:r>
+    </w:p>
+    <w:p>
+      <w:pPr>
+        <w:numPr>
+          <w:ilvl w:val="0"/>
+          <w:numId w:val="5"/>
+        </w:numPr>
+        <w:rPr>
           <w:highlight w:val="green"/>
         </w:rPr>
-        <w:t>Reference ,</w:t>
-      </w:r>
-      <w:proofErr w:type="gramEnd"/>
-      <w:r>
-        <w:rPr>
-          <w:b/>
-          <w:bCs/>
+      </w:pPr>
+      <w:r>
+        <w:rPr>
           <w:highlight w:val="green"/>
         </w:rPr>
-        <w:t xml:space="preserve"> .equals compare Content]</w:t>
-      </w:r>
-    </w:p>
-    <w:p>
-      <w:pPr>
-        <w:numPr>
-          <w:ilvl w:val="0"/>
-          <w:numId w:val="2"/>
-        </w:numPr>
-      </w:pPr>
-      <w:r>
-        <w:t xml:space="preserve">Why String is immutable? </w:t>
-      </w:r>
-      <w:r>
-        <w:t xml:space="preserve"> </w:t>
-      </w:r>
-    </w:p>
-    <w:p>
-      <w:r>
-        <w:pict w14:anchorId="7A2C8088">
-          <v:rect id="_x0000_i1139" style="width:0;height:1.5pt" o:hralign="center" o:hrstd="t" o:hr="t" fillcolor="#a0a0a0" stroked="f"/>
-        </w:pict>
-      </w:r>
-    </w:p>
-    <w:p>
-      <w:pPr>
-        <w:rPr>
-          <w:b/>
-          <w:bCs/>
-        </w:rPr>
-      </w:pPr>
-      <w:r>
-        <w:rPr>
-          <w:b/>
-          <w:bCs/>
-        </w:rPr>
-        <w:t>Day 3–4: Numbers &amp; Patterns</w:t>
-      </w:r>
-    </w:p>
-    <w:p>
-      <w:pPr>
-        <w:numPr>
-          <w:ilvl w:val="0"/>
-          <w:numId w:val="3"/>
-        </w:numPr>
-      </w:pPr>
-      <w:r>
-        <w:t xml:space="preserve">Fibonacci (loop + recursion) </w:t>
-      </w:r>
-    </w:p>
-    <w:p>
-      <w:pPr>
-        <w:numPr>
-          <w:ilvl w:val="0"/>
-          <w:numId w:val="3"/>
-        </w:numPr>
-      </w:pPr>
-      <w:r>
-        <w:t xml:space="preserve">Factorial </w:t>
-      </w:r>
-    </w:p>
-    <w:p>
-      <w:pPr>
-        <w:numPr>
-          <w:ilvl w:val="0"/>
-          <w:numId w:val="3"/>
-        </w:numPr>
-      </w:pPr>
-      <w:r>
-        <w:t xml:space="preserve">Armstrong number </w:t>
-      </w:r>
-    </w:p>
-    <w:p>
-      <w:pPr>
-        <w:numPr>
-          <w:ilvl w:val="0"/>
-          <w:numId w:val="3"/>
-        </w:numPr>
-      </w:pPr>
-      <w:r>
-        <w:t xml:space="preserve">Number patterns (pyramid, reverse) </w:t>
-      </w:r>
-    </w:p>
-    <w:p>
-      <w:r>
-        <w:rPr>
-          <w:rFonts w:ascii="Segoe UI Emoji" w:hAnsi="Segoe UI Emoji" w:cs="Segoe UI Emoji"/>
-        </w:rPr>
-        <w:t>👉</w:t>
-      </w:r>
-      <w:r>
-        <w:t xml:space="preserve"> Interview Q:</w:t>
-      </w:r>
-    </w:p>
-    <w:p>
-      <w:pPr>
-        <w:numPr>
-          <w:ilvl w:val="0"/>
-          <w:numId w:val="4"/>
-        </w:numPr>
-      </w:pPr>
-      <w:r>
-        <w:t xml:space="preserve">Recursion vs iteration? </w:t>
-      </w:r>
-    </w:p>
-    <w:p>
-      <w:pPr>
-        <w:numPr>
-          <w:ilvl w:val="0"/>
-          <w:numId w:val="4"/>
-        </w:numPr>
-      </w:pPr>
-      <w:r>
-        <w:t xml:space="preserve">Stack overflow in recursion? </w:t>
-      </w:r>
-    </w:p>
-    <w:p>
-      <w:r>
-        <w:pict w14:anchorId="184BD27A">
-          <v:rect id="_x0000_i1140" style="width:0;height:1.5pt" o:hralign="center" o:hrstd="t" o:hr="t" fillcolor="#a0a0a0" stroked="f"/>
-        </w:pict>
-      </w:r>
-    </w:p>
-    <w:p>
-      <w:pPr>
-        <w:rPr>
-          <w:b/>
-          <w:bCs/>
-        </w:rPr>
-      </w:pPr>
-      <w:r>
-        <w:rPr>
-          <w:b/>
-          <w:bCs/>
-        </w:rPr>
-        <w:t>Day 5–7: Strings (Very Important)</w:t>
+        <w:t xml:space="preserve">Duplicate characters </w:t>
       </w:r>
     </w:p>
     <w:p>
@@ -601,41 +654,14 @@
           <w:ilvl w:val="0"/>
           <w:numId w:val="5"/>
         </w:numPr>
-      </w:pPr>
-      <w:r>
-        <w:t xml:space="preserve">Reverse string (3 ways) </w:t>
-      </w:r>
-    </w:p>
-    <w:p>
-      <w:pPr>
-        <w:numPr>
-          <w:ilvl w:val="0"/>
-          <w:numId w:val="5"/>
-        </w:numPr>
-      </w:pPr>
-      <w:r>
-        <w:t xml:space="preserve">Anagram check </w:t>
-      </w:r>
-    </w:p>
-    <w:p>
-      <w:pPr>
-        <w:numPr>
-          <w:ilvl w:val="0"/>
-          <w:numId w:val="5"/>
-        </w:numPr>
-      </w:pPr>
-      <w:r>
-        <w:t xml:space="preserve">Duplicate characters </w:t>
-      </w:r>
-    </w:p>
-    <w:p>
-      <w:pPr>
-        <w:numPr>
-          <w:ilvl w:val="0"/>
-          <w:numId w:val="5"/>
-        </w:numPr>
-      </w:pPr>
-      <w:r>
+        <w:rPr>
+          <w:highlight w:val="green"/>
+        </w:rPr>
+      </w:pPr>
+      <w:r>
+        <w:rPr>
+          <w:highlight w:val="green"/>
+        </w:rPr>
         <w:t xml:space="preserve">First non-repeating character </w:t>
       </w:r>
     </w:p>
@@ -695,7 +721,7 @@
     <w:p>
       <w:r>
         <w:pict w14:anchorId="2FD6498B">
-          <v:rect id="_x0000_i1141" style="width:0;height:1.5pt" o:hralign="center" o:hrstd="t" o:hr="t" fillcolor="#a0a0a0" stroked="f"/>
+          <v:rect id="_x0000_i1027" style="width:0;height:1.5pt" o:hralign="center" o:hrstd="t" o:hr="t" fillcolor="#a0a0a0" stroked="f"/>
         </w:pict>
       </w:r>
     </w:p>
@@ -836,7 +862,7 @@
     <w:p>
       <w:r>
         <w:pict w14:anchorId="4AD02E51">
-          <v:rect id="_x0000_i1142" style="width:0;height:1.5pt" o:hralign="center" o:hrstd="t" o:hr="t" fillcolor="#a0a0a0" stroked="f"/>
+          <v:rect id="_x0000_i1028" style="width:0;height:1.5pt" o:hralign="center" o:hrstd="t" o:hr="t" fillcolor="#a0a0a0" stroked="f"/>
         </w:pict>
       </w:r>
     </w:p>
@@ -946,7 +972,7 @@
     <w:p>
       <w:r>
         <w:pict w14:anchorId="2F8DA495">
-          <v:rect id="_x0000_i1143" style="width:0;height:1.5pt" o:hralign="center" o:hrstd="t" o:hr="t" fillcolor="#a0a0a0" stroked="f"/>
+          <v:rect id="_x0000_i1029" style="width:0;height:1.5pt" o:hralign="center" o:hrstd="t" o:hr="t" fillcolor="#a0a0a0" stroked="f"/>
         </w:pict>
       </w:r>
     </w:p>
@@ -1087,7 +1113,7 @@
     <w:p>
       <w:r>
         <w:pict w14:anchorId="67EFA2B9">
-          <v:rect id="_x0000_i1144" style="width:0;height:1.5pt" o:hralign="center" o:hrstd="t" o:hr="t" fillcolor="#a0a0a0" stroked="f"/>
+          <v:rect id="_x0000_i1030" style="width:0;height:1.5pt" o:hralign="center" o:hrstd="t" o:hr="t" fillcolor="#a0a0a0" stroked="f"/>
         </w:pict>
       </w:r>
     </w:p>
@@ -1194,7 +1220,7 @@
     <w:p>
       <w:r>
         <w:pict w14:anchorId="6F426EB1">
-          <v:rect id="_x0000_i1145" style="width:0;height:1.5pt" o:hralign="center" o:hrstd="t" o:hr="t" fillcolor="#a0a0a0" stroked="f"/>
+          <v:rect id="_x0000_i1031" style="width:0;height:1.5pt" o:hralign="center" o:hrstd="t" o:hr="t" fillcolor="#a0a0a0" stroked="f"/>
         </w:pict>
       </w:r>
     </w:p>
@@ -1271,7 +1297,7 @@
     <w:p>
       <w:r>
         <w:pict w14:anchorId="629D742F">
-          <v:rect id="_x0000_i1146" style="width:0;height:1.5pt" o:hralign="center" o:hrstd="t" o:hr="t" fillcolor="#a0a0a0" stroked="f"/>
+          <v:rect id="_x0000_i1032" style="width:0;height:1.5pt" o:hralign="center" o:hrstd="t" o:hr="t" fillcolor="#a0a0a0" stroked="f"/>
         </w:pict>
       </w:r>
     </w:p>
@@ -1394,7 +1420,7 @@
     <w:p>
       <w:r>
         <w:pict w14:anchorId="4D7F20E4">
-          <v:rect id="_x0000_i1147" style="width:0;height:1.5pt" o:hralign="center" o:hrstd="t" o:hr="t" fillcolor="#a0a0a0" stroked="f"/>
+          <v:rect id="_x0000_i1033" style="width:0;height:1.5pt" o:hralign="center" o:hrstd="t" o:hr="t" fillcolor="#a0a0a0" stroked="f"/>
         </w:pict>
       </w:r>
     </w:p>
@@ -1517,7 +1543,7 @@
     <w:p>
       <w:r>
         <w:pict w14:anchorId="211DA14C">
-          <v:rect id="_x0000_i1148" style="width:0;height:1.5pt" o:hralign="center" o:hrstd="t" o:hr="t" fillcolor="#a0a0a0" stroked="f"/>
+          <v:rect id="_x0000_i1034" style="width:0;height:1.5pt" o:hralign="center" o:hrstd="t" o:hr="t" fillcolor="#a0a0a0" stroked="f"/>
         </w:pict>
       </w:r>
     </w:p>
@@ -1633,7 +1659,7 @@
     <w:p>
       <w:r>
         <w:pict w14:anchorId="08C1AB9E">
-          <v:rect id="_x0000_i1149" style="width:0;height:1.5pt" o:hralign="center" o:hrstd="t" o:hr="t" fillcolor="#a0a0a0" stroked="f"/>
+          <v:rect id="_x0000_i1035" style="width:0;height:1.5pt" o:hralign="center" o:hrstd="t" o:hr="t" fillcolor="#a0a0a0" stroked="f"/>
         </w:pict>
       </w:r>
     </w:p>
@@ -1712,7 +1738,7 @@
     <w:p>
       <w:r>
         <w:pict w14:anchorId="08E1790F">
-          <v:rect id="_x0000_i1150" style="width:0;height:1.5pt" o:hralign="center" o:hrstd="t" o:hr="t" fillcolor="#a0a0a0" stroked="f"/>
+          <v:rect id="_x0000_i1036" style="width:0;height:1.5pt" o:hralign="center" o:hrstd="t" o:hr="t" fillcolor="#a0a0a0" stroked="f"/>
         </w:pict>
       </w:r>
     </w:p>
@@ -1803,7 +1829,7 @@
     <w:p>
       <w:r>
         <w:pict w14:anchorId="4CEDF1D1">
-          <v:rect id="_x0000_i1151" style="width:0;height:1.5pt" o:hralign="center" o:hrstd="t" o:hr="t" fillcolor="#a0a0a0" stroked="f"/>
+          <v:rect id="_x0000_i1037" style="width:0;height:1.5pt" o:hralign="center" o:hrstd="t" o:hr="t" fillcolor="#a0a0a0" stroked="f"/>
         </w:pict>
       </w:r>
     </w:p>
@@ -1869,7 +1895,7 @@
     <w:p>
       <w:r>
         <w:pict w14:anchorId="5F62AFB2">
-          <v:rect id="_x0000_i1152" style="width:0;height:1.5pt" o:hralign="center" o:hrstd="t" o:hr="t" fillcolor="#a0a0a0" stroked="f"/>
+          <v:rect id="_x0000_i1038" style="width:0;height:1.5pt" o:hralign="center" o:hrstd="t" o:hr="t" fillcolor="#a0a0a0" stroked="f"/>
         </w:pict>
       </w:r>
     </w:p>
@@ -1924,7 +1950,7 @@
     <w:p>
       <w:r>
         <w:pict w14:anchorId="67FB3885">
-          <v:rect id="_x0000_i1153" style="width:0;height:1.5pt" o:hralign="center" o:hrstd="t" o:hr="t" fillcolor="#a0a0a0" stroked="f"/>
+          <v:rect id="_x0000_i1039" style="width:0;height:1.5pt" o:hralign="center" o:hrstd="t" o:hr="t" fillcolor="#a0a0a0" stroked="f"/>
         </w:pict>
       </w:r>
     </w:p>
@@ -1991,7 +2017,7 @@
     <w:p>
       <w:r>
         <w:pict w14:anchorId="2BB445FF">
-          <v:rect id="_x0000_i1154" style="width:0;height:1.5pt" o:hralign="center" o:hrstd="t" o:hr="t" fillcolor="#a0a0a0" stroked="f"/>
+          <v:rect id="_x0000_i1040" style="width:0;height:1.5pt" o:hralign="center" o:hrstd="t" o:hr="t" fillcolor="#a0a0a0" stroked="f"/>
         </w:pict>
       </w:r>
     </w:p>
@@ -2096,7 +2122,7 @@
     <w:p>
       <w:r>
         <w:pict w14:anchorId="3DEE0EE5">
-          <v:rect id="_x0000_i1155" style="width:0;height:1.5pt" o:hralign="center" o:hrstd="t" o:hr="t" fillcolor="#a0a0a0" stroked="f"/>
+          <v:rect id="_x0000_i1041" style="width:0;height:1.5pt" o:hralign="center" o:hrstd="t" o:hr="t" fillcolor="#a0a0a0" stroked="f"/>
         </w:pict>
       </w:r>
     </w:p>
@@ -2189,7 +2215,7 @@
     <w:p>
       <w:r>
         <w:pict w14:anchorId="70BE3710">
-          <v:rect id="_x0000_i1156" style="width:0;height:1.5pt" o:hralign="center" o:hrstd="t" o:hr="t" fillcolor="#a0a0a0" stroked="f"/>
+          <v:rect id="_x0000_i1042" style="width:0;height:1.5pt" o:hralign="center" o:hrstd="t" o:hr="t" fillcolor="#a0a0a0" stroked="f"/>
         </w:pict>
       </w:r>
     </w:p>
@@ -2255,7 +2281,7 @@
     <w:p>
       <w:r>
         <w:pict w14:anchorId="4C5352C7">
-          <v:rect id="_x0000_i1157" style="width:0;height:1.5pt" o:hralign="center" o:hrstd="t" o:hr="t" fillcolor="#a0a0a0" stroked="f"/>
+          <v:rect id="_x0000_i1043" style="width:0;height:1.5pt" o:hralign="center" o:hrstd="t" o:hr="t" fillcolor="#a0a0a0" stroked="f"/>
         </w:pict>
       </w:r>
     </w:p>
@@ -7374,6 +7400,7 @@
   <w:style w:type="character" w:default="1" w:styleId="DefaultParagraphFont">
     <w:name w:val="Default Paragraph Font"/>
     <w:uiPriority w:val="1"/>
+    <w:semiHidden/>
     <w:unhideWhenUsed/>
   </w:style>
   <w:style w:type="table" w:default="1" w:styleId="TableNormal">

</xml_diff>